<commit_message>
PRD v0.3: align metadata framing to interchange qualification optimization
Restore Model A as legitimate program-qualification (not fee invention);
add network-compliance/transparency guardrails; three-decision-product framing.

Co-Authored-By: Claude Opus 4.8 <noreply@anthropic.com>
</commit_message>
<xml_diff>
--- a/PRD_Vendor_Payment_Intelligence.docx
+++ b/PRD_Vendor_Payment_Intelligence.docx
@@ -43,7 +43,7 @@
           <w:sz w:val="21"/>
           <w:szCs w:val="21"/>
         </w:rPr>
-        <w:t xml:space="preserve">Value-based dynamic pricing for virtual-card supplier payments</w:t>
+        <w:t xml:space="preserve">ML-driven supplier conversion, offer optimization, and interchange qualification</w:t>
       </w:r>
     </w:p>
     <w:p>
@@ -61,7 +61,7 @@
           <w:sz w:val="18"/>
           <w:szCs w:val="18"/>
         </w:rPr>
-        <w:t xml:space="preserve">v0.2  ·  July 6, 2026  ·  Working draft (synthetic-data prototype)  ·  Precursor to the Corpay Agentic AP Automation platform</w:t>
+        <w:t xml:space="preserve">v0.3  ·  July 6, 2026  ·  Working draft (synthetic-data prototype)  ·  Precursor to the Corpay Agentic AP Automation platform</w:t>
       </w:r>
     </w:p>
     <w:p>
@@ -69,7 +69,7 @@
         <w:pStyle w:val="Heading1"/>
       </w:pPr>
       <w:r>
-        <w:t xml:space="preserve">1. Summary</w:t>
+        <w:t xml:space="preserve">1. Product Thesis</w:t>
       </w:r>
     </w:p>
     <w:p>
@@ -77,63 +77,29 @@
         <w:spacing w:after="100"/>
       </w:pPr>
       <w:r>
-        <w:t xml:space="preserve">Virtual card is Corpay's highest-margin rail, but a single static acceptance rate leaves value on the table and pushes away price-sensitive suppliers. This PRD specifies a vendor-specific dynamic-pricing engine whose objective is to maximize long-term payment volume and contribution while keeping supplier acceptance sustainable — pricing on each supplier's economics and the value delivered, not on how hard it would be for the supplier to leave.</w:t>
-      </w:r>
-    </w:p>
-    <w:p>
-      <w:pPr>
-        <w:pStyle w:val="ListParagraph"/>
-        <w:numPr>
-          <w:ilvl w:val="0"/>
-          <w:numId w:val="2"/>
-        </w:numPr>
-        <w:spacing w:after="40"/>
-      </w:pPr>
-      <w:r>
+        <w:t xml:space="preserve">Corpay can increase virtual-card contribution by making three linked decisions better: which ACH/check suppliers to approach, which transparent commercial offer to present, and which valid network program each accepted transaction should qualify for. The system is a decision layer; payment execution, authorization, ledger posting, and money movement remain in existing regulated systems.</w:t>
+      </w:r>
+    </w:p>
+    <w:p>
+      <w:pPr>
+        <w:spacing w:after="100"/>
         <w:rPr>
           <w:b/>
           <w:bCs/>
+          <w:color w:val="1F3864"/>
+          <w:sz w:val="20"/>
+          <w:szCs w:val="20"/>
         </w:rPr>
-        <w:t xml:space="preserve">Predictive model: </w:t>
-      </w:r>
-      <w:r>
-        <w:t xml:space="preserve">an XGBoost acceptance model estimates P(accept) for a supplier given an offer, learning genuine price elasticity from the full economic profile.</w:t>
-      </w:r>
-    </w:p>
-    <w:p>
-      <w:pPr>
-        <w:pStyle w:val="ListParagraph"/>
-        <w:numPr>
-          <w:ilvl w:val="0"/>
-          <w:numId w:val="2"/>
-        </w:numPr>
-        <w:spacing w:after="40"/>
       </w:pPr>
       <w:r>
         <w:rPr>
           <w:b/>
           <w:bCs/>
+          <w:color w:val="1F3864"/>
+          <w:sz w:val="20"/>
+          <w:szCs w:val="20"/>
         </w:rPr>
-        <w:t xml:space="preserve">Optimizer: </w:t>
-      </w:r>
-      <w:r>
-        <w:t xml:space="preserve">sweeps a core-lever offer grid (rate × settlement speed × fee cap, plus an ACH flat-fee fallback) and selects the offer with the highest expected long-term contribution, subject to policy and a sustainability floor.</w:t>
-      </w:r>
-    </w:p>
-    <w:p>
-      <w:pPr>
-        <w:spacing w:after="100"/>
-        <w:rPr>
-          <w:sz w:val="19"/>
-          <w:szCs w:val="19"/>
-        </w:rPr>
-      </w:pPr>
-      <w:r>
-        <w:rPr>
-          <w:sz w:val="19"/>
-          <w:szCs w:val="19"/>
-        </w:rPr>
-        <w:t xml:space="preserve">This layer decides who and how much; the separate AP Automation platform executes. Full code, models, and datasets are in the linked repository (§5).</w:t>
+        <w:t xml:space="preserve">Core principle: optimize accepted spend and long-term contribution, not the highest fee on a single transaction.</w:t>
       </w:r>
     </w:p>
     <w:tbl>
@@ -149,9 +115,9 @@
         </w:tblBorders>
       </w:tblPr>
       <w:tblGrid>
-        <w:gridCol w:w="3000"/>
-        <w:gridCol w:w="3180"/>
-        <w:gridCol w:w="3180"/>
+        <w:gridCol w:w="2340"/>
+        <w:gridCol w:w="3900"/>
+        <w:gridCol w:w="3120"/>
       </w:tblGrid>
       <w:tr>
         <w:trPr>
@@ -159,7 +125,7 @@
         </w:trPr>
         <w:tc>
           <w:tcPr>
-            <w:tcW w:type="dxa" w:w="3000"/>
+            <w:tcW w:type="dxa" w:w="2340"/>
             <w:shd w:fill="1F3864" w:val="clear"/>
             <w:tcMar>
               <w:top w:type="dxa" w:w="40"/>
@@ -177,13 +143,13 @@
                 <w:sz w:val="18"/>
                 <w:szCs w:val="18"/>
               </w:rPr>
-              <w:t xml:space="preserve">Component</w:t>
-            </w:r>
-          </w:p>
-        </w:tc>
-        <w:tc>
-          <w:tcPr>
-            <w:tcW w:type="dxa" w:w="3180"/>
+              <w:t xml:space="preserve">Decision product</w:t>
+            </w:r>
+          </w:p>
+        </w:tc>
+        <w:tc>
+          <w:tcPr>
+            <w:tcW w:type="dxa" w:w="3900"/>
             <w:shd w:fill="1F3864" w:val="clear"/>
             <w:tcMar>
               <w:top w:type="dxa" w:w="40"/>
@@ -201,13 +167,13 @@
                 <w:sz w:val="18"/>
                 <w:szCs w:val="18"/>
               </w:rPr>
-              <w:t xml:space="preserve">Metric</w:t>
-            </w:r>
-          </w:p>
-        </w:tc>
-        <w:tc>
-          <w:tcPr>
-            <w:tcW w:type="dxa" w:w="3180"/>
+              <w:t xml:space="preserve">Primary question</w:t>
+            </w:r>
+          </w:p>
+        </w:tc>
+        <w:tc>
+          <w:tcPr>
+            <w:tcW w:type="dxa" w:w="3120"/>
             <w:shd w:fill="1F3864" w:val="clear"/>
             <w:tcMar>
               <w:top w:type="dxa" w:w="40"/>
@@ -225,7 +191,7 @@
                 <w:sz w:val="18"/>
                 <w:szCs w:val="18"/>
               </w:rPr>
-              <w:t xml:space="preserve">Result</w:t>
+              <w:t xml:space="preserve">Production output</w:t>
             </w:r>
           </w:p>
         </w:tc>
@@ -236,73 +202,73 @@
         </w:trPr>
         <w:tc>
           <w:tcPr>
-            <w:tcW w:type="dxa" w:w="3000"/>
-            <w:shd w:fill="FFFFFF" w:val="clear"/>
-            <w:tcMar>
-              <w:top w:type="dxa" w:w="40"/>
-              <w:left w:type="dxa" w:w="100"/>
-              <w:bottom w:type="dxa" w:w="40"/>
-              <w:right w:type="dxa" w:w="100"/>
-            </w:tcMar>
-          </w:tcPr>
-          <w:p>
-            <w:r>
-              <w:rPr>
-                <w:b w:val="false"/>
-                <w:bCs w:val="false"/>
-                <w:color w:val="000000"/>
-                <w:sz w:val="18"/>
-                <w:szCs w:val="18"/>
-              </w:rPr>
-              <w:t xml:space="preserve">Acceptance model</w:t>
-            </w:r>
-          </w:p>
-        </w:tc>
-        <w:tc>
-          <w:tcPr>
-            <w:tcW w:type="dxa" w:w="3180"/>
-            <w:shd w:fill="FFFFFF" w:val="clear"/>
-            <w:tcMar>
-              <w:top w:type="dxa" w:w="40"/>
-              <w:left w:type="dxa" w:w="100"/>
-              <w:bottom w:type="dxa" w:w="40"/>
-              <w:right w:type="dxa" w:w="100"/>
-            </w:tcMar>
-          </w:tcPr>
-          <w:p>
-            <w:r>
-              <w:rPr>
-                <w:b w:val="false"/>
-                <w:bCs w:val="false"/>
-                <w:color w:val="000000"/>
-                <w:sz w:val="18"/>
-                <w:szCs w:val="18"/>
-              </w:rPr>
-              <w:t xml:space="preserve">ROC-AUC / PR-AUC / Brier</w:t>
-            </w:r>
-          </w:p>
-        </w:tc>
-        <w:tc>
-          <w:tcPr>
-            <w:tcW w:type="dxa" w:w="3180"/>
-            <w:shd w:fill="FFFFFF" w:val="clear"/>
-            <w:tcMar>
-              <w:top w:type="dxa" w:w="40"/>
-              <w:left w:type="dxa" w:w="100"/>
-              <w:bottom w:type="dxa" w:w="40"/>
-              <w:right w:type="dxa" w:w="100"/>
-            </w:tcMar>
-          </w:tcPr>
-          <w:p>
-            <w:r>
-              <w:rPr>
-                <w:b w:val="false"/>
-                <w:bCs w:val="false"/>
-                <w:color w:val="000000"/>
-                <w:sz w:val="18"/>
-                <w:szCs w:val="18"/>
-              </w:rPr>
-              <w:t xml:space="preserve">0.775 / 0.846 / 0.190</w:t>
+            <w:tcW w:type="dxa" w:w="2340"/>
+            <w:shd w:fill="FFFFFF" w:val="clear"/>
+            <w:tcMar>
+              <w:top w:type="dxa" w:w="40"/>
+              <w:left w:type="dxa" w:w="100"/>
+              <w:bottom w:type="dxa" w:w="40"/>
+              <w:right w:type="dxa" w:w="100"/>
+            </w:tcMar>
+          </w:tcPr>
+          <w:p>
+            <w:r>
+              <w:rPr>
+                <w:b w:val="false"/>
+                <w:bCs w:val="false"/>
+                <w:color w:val="000000"/>
+                <w:sz w:val="18"/>
+                <w:szCs w:val="18"/>
+              </w:rPr>
+              <w:t xml:space="preserve">B · Supplier conversion propensity</w:t>
+            </w:r>
+          </w:p>
+        </w:tc>
+        <w:tc>
+          <w:tcPr>
+            <w:tcW w:type="dxa" w:w="3900"/>
+            <w:shd w:fill="FFFFFF" w:val="clear"/>
+            <w:tcMar>
+              <w:top w:type="dxa" w:w="40"/>
+              <w:left w:type="dxa" w:w="100"/>
+              <w:bottom w:type="dxa" w:w="40"/>
+              <w:right w:type="dxa" w:w="100"/>
+            </w:tcMar>
+          </w:tcPr>
+          <w:p>
+            <w:r>
+              <w:rPr>
+                <w:b w:val="false"/>
+                <w:bCs w:val="false"/>
+                <w:color w:val="000000"/>
+                <w:sz w:val="18"/>
+                <w:szCs w:val="18"/>
+              </w:rPr>
+              <w:t xml:space="preserve">Which suppliers are likely to accept virtual card at economically viable terms?</w:t>
+            </w:r>
+          </w:p>
+        </w:tc>
+        <w:tc>
+          <w:tcPr>
+            <w:tcW w:type="dxa" w:w="3120"/>
+            <w:shd w:fill="FFFFFF" w:val="clear"/>
+            <w:tcMar>
+              <w:top w:type="dxa" w:w="40"/>
+              <w:left w:type="dxa" w:w="100"/>
+              <w:bottom w:type="dxa" w:w="40"/>
+              <w:right w:type="dxa" w:w="100"/>
+            </w:tcMar>
+          </w:tcPr>
+          <w:p>
+            <w:r>
+              <w:rPr>
+                <w:b w:val="false"/>
+                <w:bCs w:val="false"/>
+                <w:color w:val="000000"/>
+                <w:sz w:val="18"/>
+                <w:szCs w:val="18"/>
+              </w:rPr>
+              <w:t xml:space="preserve">Ranked outreach queue with expected accepted spend</w:t>
             </w:r>
           </w:p>
         </w:tc>
@@ -313,7 +279,7 @@
         </w:trPr>
         <w:tc>
           <w:tcPr>
-            <w:tcW w:type="dxa" w:w="3000"/>
+            <w:tcW w:type="dxa" w:w="2340"/>
             <w:shd w:fill="F2F2F2" w:val="clear"/>
             <w:tcMar>
               <w:top w:type="dxa" w:w="40"/>
@@ -331,13 +297,13 @@
                 <w:sz w:val="18"/>
                 <w:szCs w:val="18"/>
               </w:rPr>
-              <w:t xml:space="preserve">Acceptance model</w:t>
-            </w:r>
-          </w:p>
-        </w:tc>
-        <w:tc>
-          <w:tcPr>
-            <w:tcW w:type="dxa" w:w="3180"/>
+              <w:t xml:space="preserve">C · Offer optimization</w:t>
+            </w:r>
+          </w:p>
+        </w:tc>
+        <w:tc>
+          <w:tcPr>
+            <w:tcW w:type="dxa" w:w="3900"/>
             <w:shd w:fill="F2F2F2" w:val="clear"/>
             <w:tcMar>
               <w:top w:type="dxa" w:w="40"/>
@@ -355,13 +321,13 @@
                 <w:sz w:val="18"/>
                 <w:szCs w:val="18"/>
               </w:rPr>
-              <w:t xml:space="preserve">Learned rate elasticity</w:t>
-            </w:r>
-          </w:p>
-        </w:tc>
-        <w:tc>
-          <w:tcPr>
-            <w:tcW w:type="dxa" w:w="3180"/>
+              <w:t xml:space="preserve">Which offer maximizes expected long-term contribution for this supplier?</w:t>
+            </w:r>
+          </w:p>
+        </w:tc>
+        <w:tc>
+          <w:tcPr>
+            <w:tcW w:type="dxa" w:w="3120"/>
             <w:shd w:fill="F2F2F2" w:val="clear"/>
             <w:tcMar>
               <w:top w:type="dxa" w:w="40"/>
@@ -379,7 +345,7 @@
                 <w:sz w:val="18"/>
                 <w:szCs w:val="18"/>
               </w:rPr>
-              <w:t xml:space="preserve">accept 0.77→0.51 across 80→280 bps</w:t>
+              <w:t xml:space="preserve">Rate/subsidy, fee cap, settlement speed, rebate share, rail fallback</w:t>
             </w:r>
           </w:p>
         </w:tc>
@@ -390,73 +356,73 @@
         </w:trPr>
         <w:tc>
           <w:tcPr>
-            <w:tcW w:type="dxa" w:w="3000"/>
-            <w:shd w:fill="FFFFFF" w:val="clear"/>
-            <w:tcMar>
-              <w:top w:type="dxa" w:w="40"/>
-              <w:left w:type="dxa" w:w="100"/>
-              <w:bottom w:type="dxa" w:w="40"/>
-              <w:right w:type="dxa" w:w="100"/>
-            </w:tcMar>
-          </w:tcPr>
-          <w:p>
-            <w:r>
-              <w:rPr>
-                <w:b w:val="false"/>
-                <w:bCs w:val="false"/>
-                <w:color w:val="000000"/>
-                <w:sz w:val="18"/>
-                <w:szCs w:val="18"/>
-              </w:rPr>
-              <w:t xml:space="preserve">Optimizer</w:t>
-            </w:r>
-          </w:p>
-        </w:tc>
-        <w:tc>
-          <w:tcPr>
-            <w:tcW w:type="dxa" w:w="3180"/>
-            <w:shd w:fill="FFFFFF" w:val="clear"/>
-            <w:tcMar>
-              <w:top w:type="dxa" w:w="40"/>
-              <w:left w:type="dxa" w:w="100"/>
-              <w:bottom w:type="dxa" w:w="40"/>
-              <w:right w:type="dxa" w:w="100"/>
-            </w:tcMar>
-          </w:tcPr>
-          <w:p>
-            <w:r>
-              <w:rPr>
-                <w:b w:val="false"/>
-                <w:bCs w:val="false"/>
-                <w:color w:val="000000"/>
-                <w:sz w:val="18"/>
-                <w:szCs w:val="18"/>
-              </w:rPr>
-              <w:t xml:space="preserve">Portfolio</w:t>
-            </w:r>
-          </w:p>
-        </w:tc>
-        <w:tc>
-          <w:tcPr>
-            <w:tcW w:type="dxa" w:w="3180"/>
-            <w:shd w:fill="FFFFFF" w:val="clear"/>
-            <w:tcMar>
-              <w:top w:type="dxa" w:w="40"/>
-              <w:left w:type="dxa" w:w="100"/>
-              <w:bottom w:type="dxa" w:w="40"/>
-              <w:right w:type="dxa" w:w="100"/>
-            </w:tcMar>
-          </w:tcPr>
-          <w:p>
-            <w:r>
-              <w:rPr>
-                <w:b w:val="false"/>
-                <w:bCs w:val="false"/>
-                <w:color w:val="000000"/>
-                <w:sz w:val="18"/>
-                <w:szCs w:val="18"/>
-              </w:rPr>
-              <w:t xml:space="preserve">15,000 vendors priced; 81% card / 19% ACH fallback</w:t>
+            <w:tcW w:type="dxa" w:w="2340"/>
+            <w:shd w:fill="FFFFFF" w:val="clear"/>
+            <w:tcMar>
+              <w:top w:type="dxa" w:w="40"/>
+              <w:left w:type="dxa" w:w="100"/>
+              <w:bottom w:type="dxa" w:w="40"/>
+              <w:right w:type="dxa" w:w="100"/>
+            </w:tcMar>
+          </w:tcPr>
+          <w:p>
+            <w:r>
+              <w:rPr>
+                <w:b w:val="false"/>
+                <w:bCs w:val="false"/>
+                <w:color w:val="000000"/>
+                <w:sz w:val="18"/>
+                <w:szCs w:val="18"/>
+              </w:rPr>
+              <w:t xml:space="preserve">A · Qualification optimization</w:t>
+            </w:r>
+          </w:p>
+        </w:tc>
+        <w:tc>
+          <w:tcPr>
+            <w:tcW w:type="dxa" w:w="3900"/>
+            <w:shd w:fill="FFFFFF" w:val="clear"/>
+            <w:tcMar>
+              <w:top w:type="dxa" w:w="40"/>
+              <w:left w:type="dxa" w:w="100"/>
+              <w:bottom w:type="dxa" w:w="40"/>
+              <w:right w:type="dxa" w:w="100"/>
+            </w:tcMar>
+          </w:tcPr>
+          <w:p>
+            <w:r>
+              <w:rPr>
+                <w:b w:val="false"/>
+                <w:bCs w:val="false"/>
+                <w:color w:val="000000"/>
+                <w:sz w:val="18"/>
+                <w:szCs w:val="18"/>
+              </w:rPr>
+              <w:t xml:space="preserve">Which legitimate published interchange program can the transaction qualify for?</w:t>
+            </w:r>
+          </w:p>
+        </w:tc>
+        <w:tc>
+          <w:tcPr>
+            <w:tcW w:type="dxa" w:w="3120"/>
+            <w:shd w:fill="FFFFFF" w:val="clear"/>
+            <w:tcMar>
+              <w:top w:type="dxa" w:w="40"/>
+              <w:left w:type="dxa" w:w="100"/>
+              <w:bottom w:type="dxa" w:w="40"/>
+              <w:right w:type="dxa" w:w="100"/>
+            </w:tcMar>
+          </w:tcPr>
+          <w:p>
+            <w:r>
+              <w:rPr>
+                <w:b w:val="false"/>
+                <w:bCs w:val="false"/>
+                <w:color w:val="000000"/>
+                <w:sz w:val="18"/>
+                <w:szCs w:val="18"/>
+              </w:rPr>
+              <w:t xml:space="preserve">Required data fields, program eligibility, expected net economics</w:t>
             </w:r>
           </w:p>
         </w:tc>
@@ -475,7 +441,7 @@
         <w:spacing w:after="100"/>
       </w:pPr>
       <w:r>
-        <w:t xml:space="preserve">Interchange is priced by transaction metadata and by supplier acceptance behavior. Corpay holds all the metadata and offers it in full as reconciliation value; the real pricing levers are the effective acceptance rate, settlement speed, and whether a fee cap or ACH fallback applies. A defensible engine must price each supplier on economics such as:</w:t>
+        <w:t xml:space="preserve">Virtual card is economically attractive, but adoption is constrained by supplier acceptance cost, invoice size, merchant pricing, operational burden, and relationship dynamics. Static campaigns waste effort on low-propensity suppliers; static offers overpay easy conversions and lose price-sensitive ones; and after conversion, incomplete qualification logic can leave legitimate interchange economics unrealized. A defensible engine prices each supplier on economics such as:</w:t>
       </w:r>
     </w:p>
     <w:tbl>
@@ -987,7 +953,7 @@
           <w:sz w:val="19"/>
           <w:szCs w:val="19"/>
         </w:rPr>
-        <w:t xml:space="preserve">Objective (explicit): maximize long-term contribution while keeping acceptance sustainable — NOT charge the highest possible fee to suppliers least able to leave. Rates illustrative; networks set interchange, Corpay optimizes the negotiable supplier package.</w:t>
+        <w:t xml:space="preserve">Objective (explicit): maximize long-term contribution while keeping acceptance sustainable — NOT charge the highest possible fee to suppliers least able to leave. Rates illustrative; networks set interchange, Corpay optimizes the negotiable, disclosed supplier package.</w:t>
       </w:r>
     </w:p>
     <w:p>
@@ -995,7 +961,15 @@
         <w:pStyle w:val="Heading1"/>
       </w:pPr>
       <w:r>
-        <w:t xml:space="preserve">3. System Design</w:t>
+        <w:t xml:space="preserve">3. Decision Products &amp; Design</w:t>
+      </w:r>
+    </w:p>
+    <w:p>
+      <w:pPr>
+        <w:pStyle w:val="Heading2"/>
+      </w:pPr>
+      <w:r>
+        <w:t xml:space="preserve">Model B — supplier conversion propensity</w:t>
       </w:r>
     </w:p>
     <w:p>
@@ -1011,7 +985,55 @@
           <w:sz w:val="19"/>
           <w:szCs w:val="19"/>
         </w:rPr>
-        <w:t xml:space="preserve">Four layers. The prototype builds layers 1–2; layers 3–4 are scoped as documented stubs.</w:t>
+        <w:t xml:space="preserve">Predict enrollment probability, first-payment acceptance, and expected accepted spend over 12 months. Ranking is by economic value, not raw probability: priority = expected accepted spend × net take − enrollment cost − servicing cost − expected attrition loss.</w:t>
+      </w:r>
+    </w:p>
+    <w:p>
+      <w:pPr>
+        <w:pStyle w:val="Heading2"/>
+      </w:pPr>
+      <w:r>
+        <w:t xml:space="preserve">Model C — offer optimization</w:t>
+      </w:r>
+    </w:p>
+    <w:p>
+      <w:pPr>
+        <w:spacing w:after="100"/>
+        <w:rPr>
+          <w:sz w:val="19"/>
+          <w:szCs w:val="19"/>
+        </w:rPr>
+      </w:pPr>
+      <w:r>
+        <w:rPr>
+          <w:sz w:val="19"/>
+          <w:szCs w:val="19"/>
+        </w:rPr>
+        <w:t xml:space="preserve">Select from approved, transparent packages — effective rate/subsidy, fee structure (percentage, fixed, capped, volume tiers), settlement speed, ACH rail fallback, and full-remittance service level. The engine estimates acceptance and lifetime contribution per eligible offer and picks the highest-value action within policy. Metadata is offered in full as reconciliation value; it is never withheld as a lever.</w:t>
+      </w:r>
+    </w:p>
+    <w:p>
+      <w:pPr>
+        <w:pStyle w:val="Heading2"/>
+      </w:pPr>
+      <w:r>
+        <w:t xml:space="preserve">Model A — interchange qualification optimization  (metadata)</w:t>
+      </w:r>
+    </w:p>
+    <w:p>
+      <w:pPr>
+        <w:spacing w:after="100"/>
+        <w:rPr>
+          <w:sz w:val="19"/>
+          <w:szCs w:val="19"/>
+        </w:rPr>
+      </w:pPr>
+      <w:r>
+        <w:rPr>
+          <w:sz w:val="19"/>
+          <w:szCs w:val="19"/>
+        </w:rPr>
+        <w:t xml:space="preserve">For accepted virtual-card payments, determine the best valid published program and the exact fields required to qualify. This is NOT supplier-specific fee invention — eligibility is constrained by network rules, card product, MCC, geography, transaction type, settlement timing, acquirer submission, and data completeness.</w:t>
       </w:r>
     </w:p>
     <w:p>
@@ -1024,14 +1046,7 @@
         <w:spacing w:after="40"/>
       </w:pPr>
       <w:r>
-        <w:rPr>
-          <w:b/>
-          <w:bCs/>
-        </w:rPr>
-        <w:t xml:space="preserve">1 · Predictive models — </w:t>
-      </w:r>
-      <w:r>
-        <w:t xml:space="preserve">offer-conditioned acceptance (built); churn and servicing-cost as future inputs.</w:t>
+        <w:t xml:space="preserve">Always transmit the complete remittance data required for supplier reconciliation and contractual obligations.</w:t>
       </w:r>
     </w:p>
     <w:p>
@@ -1044,14 +1059,7 @@
         <w:spacing w:after="40"/>
       </w:pPr>
       <w:r>
-        <w:rPr>
-          <w:b/>
-          <w:bCs/>
-        </w:rPr>
-        <w:t xml:space="preserve">2 · Optimization engine — </w:t>
-      </w:r>
-      <w:r>
-        <w:t xml:space="preserve">enumerates the offer grid, computes expected long-term contribution, picks the best offer under policy (built).</w:t>
+        <w:t xml:space="preserve">Optimize only across legitimate eligible programs; never misclassify or suppress required fields.</w:t>
       </w:r>
     </w:p>
     <w:p>
@@ -1064,14 +1072,7 @@
         <w:spacing w:after="40"/>
       </w:pPr>
       <w:r>
-        <w:rPr>
-          <w:b/>
-          <w:bCs/>
-        </w:rPr>
-        <w:t xml:space="preserve">3 · LLM signal extractor — </w:t>
-      </w:r>
-      <w:r>
-        <w:t xml:space="preserve">reads supplier emails/contracts into structured signals (margin, speed preference, objections). Documented stub.</w:t>
+        <w:t xml:space="preserve">Baseline remittance data is never degraded to create lock-in.</w:t>
       </w:r>
     </w:p>
     <w:p>
@@ -1084,14 +1085,7 @@
         <w:spacing w:after="40"/>
       </w:pPr>
       <w:r>
-        <w:rPr>
-          <w:b/>
-          <w:bCs/>
-        </w:rPr>
-        <w:t xml:space="preserve">4 · Policy layer — </w:t>
-      </w:r>
-      <w:r>
-        <w:t xml:space="preserve">min/max pricing, fee caps, fairness (similar economics → similar offers), disclosure. Documented stub.</w:t>
+        <w:t xml:space="preserve">Measure realized qualification rate and net contribution after buyer rebates, network costs, subsidies, support, and attrition.</w:t>
       </w:r>
     </w:p>
     <w:p>
@@ -1099,7 +1093,7 @@
         <w:pStyle w:val="Heading2"/>
       </w:pPr>
       <w:r>
-        <w:t xml:space="preserve">Objective function</w:t>
+        <w:t xml:space="preserve">Objective function (Model C) &amp; label discipline</w:t>
       </w:r>
     </w:p>
     <w:p>
@@ -1115,31 +1109,7 @@
           <w:sz w:val="19"/>
           <w:szCs w:val="19"/>
         </w:rPr>
-        <w:t xml:space="preserve">For each candidate offer: annual_card = card_gross(offer) − servicing_cost; retention = 0.60 + 0.35·P(accept); E[LTV] = P(accept)·annual_card·Σ retentionᵗ + (1−P(accept))·ACH_annual·H. Only offers with P(accept) ≥ 0.40 are eligible, else the ACH fallback is recommended. The retention multiplier makes high-volume, thin-margin suppliers worth more at sustainable low rates — encoding the objective directly.</w:t>
-      </w:r>
-    </w:p>
-    <w:p>
-      <w:pPr>
-        <w:pStyle w:val="Heading2"/>
-      </w:pPr>
-      <w:r>
-        <w:t xml:space="preserve">Label discipline</w:t>
-      </w:r>
-    </w:p>
-    <w:p>
-      <w:pPr>
-        <w:spacing w:after="100"/>
-        <w:rPr>
-          <w:sz w:val="19"/>
-          <w:szCs w:val="19"/>
-        </w:rPr>
-      </w:pPr>
-      <w:r>
-        <w:rPr>
-          <w:sz w:val="19"/>
-          <w:szCs w:val="19"/>
-        </w:rPr>
-        <w:t xml:space="preserve">Acceptance labels are simulated outcomes of an offer (accept ~ Bernoulli(P)) driven by latent elasticity/capability the model never sees — so classes overlap and there is genuine Bayes error, not a rule the model can reverse-engineer. Acceptance is a function of the offer terms, letting the optimizer trade rate against acceptance.</w:t>
+        <w:t xml:space="preserve">annual_card = card_gross(offer) − servicing_cost; retention = 0.60 + 0.35·P(accept); E[LTV] = P(accept)·annual_card·Σ retentionᵗ + (1−P(accept))·ACH_annual·H. Only offers with P(accept) ≥ 0.40 are eligible, else ACH fallback. The retention multiplier makes high-volume, thin-margin suppliers worth more at sustainable low rates. Acceptance labels are simulated offer outcomes (accept ~ Bernoulli(P)) driven by latent elasticity the model never sees, so the optimizer can trade rate against acceptance.</w:t>
       </w:r>
     </w:p>
     <w:p>
@@ -1513,7 +1483,7 @@
           <w:sz w:val="19"/>
           <w:szCs w:val="19"/>
         </w:rPr>
-        <w:t xml:space="preserve">Elasticity is learned: predicted acceptance declines monotonically as the offered rate rises (0.77 → 0.68 → 0.59 → 0.51 across 80/150/220/280 bps) — exactly what the optimizer needs.</w:t>
+        <w:t xml:space="preserve">Metrics: ROC-AUC 0.775, PR-AUC 0.846, Brier 0.190. Elasticity is learned — predicted acceptance declines monotonically as the offered rate rises (0.77 → 0.68 → 0.59 → 0.51 across 80/150/220/280 bps).</w:t>
       </w:r>
     </w:p>
     <w:p>
@@ -1951,16 +1921,18 @@
       <w:pPr>
         <w:spacing w:after="100"/>
         <w:rPr>
+          <w:color w:val="606060"/>
           <w:sz w:val="19"/>
           <w:szCs w:val="19"/>
         </w:rPr>
       </w:pPr>
       <w:r>
         <w:rPr>
+          <w:color w:val="606060"/>
           <w:sz w:val="19"/>
           <w:szCs w:val="19"/>
         </w:rPr>
-        <w:t xml:space="preserve">Supplier C shows the anti-extraction behavior: the large-invoice pain term collapses acceptance on high uncapped fees, so the optimizer walks the rate down. It also surfaced that capping ($500/txn) made the card unprofitable against servicing cost, so a low sustainable percentage wins. Portfolio: mean recommended card rate 233 bps, with a spread from 80 to 280 bps rather than a single static rate.</w:t>
+        <w:t xml:space="preserve">Honest interpretation: the synthetic prototype validates pipeline mechanics and metric definitions, not production lift — labels come from the same simulated world as the features. The 5-fold CV lift (0.786 vs 0.773) and 0.117 train/test gap are to be validated, not treated as safe.</w:t>
       </w:r>
     </w:p>
     <w:p>
@@ -1984,7 +1956,7 @@
         </w:rPr>
         <w:t xml:space="preserve">Repository (private): </w:t>
       </w:r>
-      <w:hyperlink w:history="1" r:id="rIdv-gh41gu8csqfj3amiquj">
+      <w:hyperlink w:history="1" r:id="rIdls64homnzbrrlazq-6myb">
         <w:r>
           <w:rPr>
             <w:rStyle w:val="Hyperlink"/>
@@ -2717,66 +2689,360 @@
         <w:pStyle w:val="Heading1"/>
       </w:pPr>
       <w:r>
-        <w:t xml:space="preserve">6. Economics, Risks &amp; Next Steps</w:t>
-      </w:r>
-    </w:p>
-    <w:p>
-      <w:pPr>
-        <w:spacing w:after="40"/>
+        <w:t xml:space="preserve">6. Requirements, Guardrails &amp; Next Steps</w:t>
+      </w:r>
+    </w:p>
+    <w:tbl>
+      <w:tblPr>
+        <w:tblW w:type="dxa" w:w="9360"/>
+        <w:tblBorders>
+          <w:top w:val="single" w:color="BFBFBF" w:sz="1"/>
+          <w:left w:val="single" w:color="BFBFBF" w:sz="1"/>
+          <w:bottom w:val="single" w:color="BFBFBF" w:sz="1"/>
+          <w:right w:val="single" w:color="BFBFBF" w:sz="1"/>
+          <w:insideH w:val="single" w:color="BFBFBF" w:sz="1"/>
+          <w:insideV w:val="single" w:color="BFBFBF" w:sz="1"/>
+        </w:tblBorders>
+      </w:tblPr>
+      <w:tblGrid>
+        <w:gridCol w:w="3000"/>
+        <w:gridCol w:w="6360"/>
+      </w:tblGrid>
+      <w:tr>
+        <w:trPr>
+          <w:tblHeader/>
+        </w:trPr>
+        <w:tc>
+          <w:tcPr>
+            <w:tcW w:type="dxa" w:w="3000"/>
+            <w:shd w:fill="1F3864" w:val="clear"/>
+            <w:tcMar>
+              <w:top w:type="dxa" w:w="40"/>
+              <w:left w:type="dxa" w:w="100"/>
+              <w:bottom w:type="dxa" w:w="40"/>
+              <w:right w:type="dxa" w:w="100"/>
+            </w:tcMar>
+          </w:tcPr>
+          <w:p>
+            <w:r>
+              <w:rPr>
+                <w:b/>
+                <w:bCs/>
+                <w:color w:val="FFFFFF"/>
+                <w:sz w:val="18"/>
+                <w:szCs w:val="18"/>
+              </w:rPr>
+              <w:t xml:space="preserve">Requirement</w:t>
+            </w:r>
+          </w:p>
+        </w:tc>
+        <w:tc>
+          <w:tcPr>
+            <w:tcW w:type="dxa" w:w="6360"/>
+            <w:shd w:fill="1F3864" w:val="clear"/>
+            <w:tcMar>
+              <w:top w:type="dxa" w:w="40"/>
+              <w:left w:type="dxa" w:w="100"/>
+              <w:bottom w:type="dxa" w:w="40"/>
+              <w:right w:type="dxa" w:w="100"/>
+            </w:tcMar>
+          </w:tcPr>
+          <w:p>
+            <w:r>
+              <w:rPr>
+                <w:b/>
+                <w:bCs/>
+                <w:color w:val="FFFFFF"/>
+                <w:sz w:val="18"/>
+                <w:szCs w:val="18"/>
+              </w:rPr>
+              <w:t xml:space="preserve">Definition of done</w:t>
+            </w:r>
+          </w:p>
+        </w:tc>
+      </w:tr>
+      <w:tr>
+        <w:trPr>
+          <w:tblHeader w:val="false"/>
+        </w:trPr>
+        <w:tc>
+          <w:tcPr>
+            <w:tcW w:type="dxa" w:w="3000"/>
+            <w:shd w:fill="FFFFFF" w:val="clear"/>
+            <w:tcMar>
+              <w:top w:type="dxa" w:w="40"/>
+              <w:left w:type="dxa" w:w="100"/>
+              <w:bottom w:type="dxa" w:w="40"/>
+              <w:right w:type="dxa" w:w="100"/>
+            </w:tcMar>
+          </w:tcPr>
+          <w:p>
+            <w:r>
+              <w:rPr>
+                <w:b w:val="false"/>
+                <w:bCs w:val="false"/>
+                <w:color w:val="000000"/>
+                <w:sz w:val="18"/>
+                <w:szCs w:val="18"/>
+              </w:rPr>
+              <w:t xml:space="preserve">Network compliance</w:t>
+            </w:r>
+          </w:p>
+        </w:tc>
+        <w:tc>
+          <w:tcPr>
+            <w:tcW w:type="dxa" w:w="6360"/>
+            <w:shd w:fill="FFFFFF" w:val="clear"/>
+            <w:tcMar>
+              <w:top w:type="dxa" w:w="40"/>
+              <w:left w:type="dxa" w:w="100"/>
+              <w:bottom w:type="dxa" w:w="40"/>
+              <w:right w:type="dxa" w:w="100"/>
+            </w:tcMar>
+          </w:tcPr>
+          <w:p>
+            <w:r>
+              <w:rPr>
+                <w:b w:val="false"/>
+                <w:bCs w:val="false"/>
+                <w:color w:val="000000"/>
+                <w:sz w:val="18"/>
+                <w:szCs w:val="18"/>
+              </w:rPr>
+              <w:t xml:space="preserve">Qualification uses published rules and evidence; no intentional misclassification or suppression of required data</w:t>
+            </w:r>
+          </w:p>
+        </w:tc>
+      </w:tr>
+      <w:tr>
+        <w:trPr>
+          <w:tblHeader w:val="false"/>
+        </w:trPr>
+        <w:tc>
+          <w:tcPr>
+            <w:tcW w:type="dxa" w:w="3000"/>
+            <w:shd w:fill="F2F2F2" w:val="clear"/>
+            <w:tcMar>
+              <w:top w:type="dxa" w:w="40"/>
+              <w:left w:type="dxa" w:w="100"/>
+              <w:bottom w:type="dxa" w:w="40"/>
+              <w:right w:type="dxa" w:w="100"/>
+            </w:tcMar>
+          </w:tcPr>
+          <w:p>
+            <w:r>
+              <w:rPr>
+                <w:b w:val="false"/>
+                <w:bCs w:val="false"/>
+                <w:color w:val="000000"/>
+                <w:sz w:val="18"/>
+                <w:szCs w:val="18"/>
+              </w:rPr>
+              <w:t xml:space="preserve">Supplier transparency</w:t>
+            </w:r>
+          </w:p>
+        </w:tc>
+        <w:tc>
+          <w:tcPr>
+            <w:tcW w:type="dxa" w:w="6360"/>
+            <w:shd w:fill="F2F2F2" w:val="clear"/>
+            <w:tcMar>
+              <w:top w:type="dxa" w:w="40"/>
+              <w:left w:type="dxa" w:w="100"/>
+              <w:bottom w:type="dxa" w:w="40"/>
+              <w:right w:type="dxa" w:w="100"/>
+            </w:tcMar>
+          </w:tcPr>
+          <w:p>
+            <w:r>
+              <w:rPr>
+                <w:b w:val="false"/>
+                <w:bCs w:val="false"/>
+                <w:color w:val="000000"/>
+                <w:sz w:val="18"/>
+                <w:szCs w:val="18"/>
+              </w:rPr>
+              <w:t xml:space="preserve">Pricing, settlement, and material terms disclosed; baseline remittance data is never degraded to create lock-in</w:t>
+            </w:r>
+          </w:p>
+        </w:tc>
+      </w:tr>
+      <w:tr>
+        <w:trPr>
+          <w:tblHeader w:val="false"/>
+        </w:trPr>
+        <w:tc>
+          <w:tcPr>
+            <w:tcW w:type="dxa" w:w="3000"/>
+            <w:shd w:fill="FFFFFF" w:val="clear"/>
+            <w:tcMar>
+              <w:top w:type="dxa" w:w="40"/>
+              <w:left w:type="dxa" w:w="100"/>
+              <w:bottom w:type="dxa" w:w="40"/>
+              <w:right w:type="dxa" w:w="100"/>
+            </w:tcMar>
+          </w:tcPr>
+          <w:p>
+            <w:r>
+              <w:rPr>
+                <w:b w:val="false"/>
+                <w:bCs w:val="false"/>
+                <w:color w:val="000000"/>
+                <w:sz w:val="18"/>
+                <w:szCs w:val="18"/>
+              </w:rPr>
+              <w:t xml:space="preserve">Fairness</w:t>
+            </w:r>
+          </w:p>
+        </w:tc>
+        <w:tc>
+          <w:tcPr>
+            <w:tcW w:type="dxa" w:w="6360"/>
+            <w:shd w:fill="FFFFFF" w:val="clear"/>
+            <w:tcMar>
+              <w:top w:type="dxa" w:w="40"/>
+              <w:left w:type="dxa" w:w="100"/>
+              <w:bottom w:type="dxa" w:w="40"/>
+              <w:right w:type="dxa" w:w="100"/>
+            </w:tcMar>
+          </w:tcPr>
+          <w:p>
+            <w:r>
+              <w:rPr>
+                <w:b w:val="false"/>
+                <w:bCs w:val="false"/>
+                <w:color w:val="000000"/>
+                <w:sz w:val="18"/>
+                <w:szCs w:val="18"/>
+              </w:rPr>
+              <w:t xml:space="preserve">No sensitive personal attributes; price on economics only; enforce rate floors/caps and strategic-supplier overrides</w:t>
+            </w:r>
+          </w:p>
+        </w:tc>
+      </w:tr>
+      <w:tr>
+        <w:trPr>
+          <w:tblHeader w:val="false"/>
+        </w:trPr>
+        <w:tc>
+          <w:tcPr>
+            <w:tcW w:type="dxa" w:w="3000"/>
+            <w:shd w:fill="F2F2F2" w:val="clear"/>
+            <w:tcMar>
+              <w:top w:type="dxa" w:w="40"/>
+              <w:left w:type="dxa" w:w="100"/>
+              <w:bottom w:type="dxa" w:w="40"/>
+              <w:right w:type="dxa" w:w="100"/>
+            </w:tcMar>
+          </w:tcPr>
+          <w:p>
+            <w:r>
+              <w:rPr>
+                <w:b w:val="false"/>
+                <w:bCs w:val="false"/>
+                <w:color w:val="000000"/>
+                <w:sz w:val="18"/>
+                <w:szCs w:val="18"/>
+              </w:rPr>
+              <w:t xml:space="preserve">Human control</w:t>
+            </w:r>
+          </w:p>
+        </w:tc>
+        <w:tc>
+          <w:tcPr>
+            <w:tcW w:type="dxa" w:w="6360"/>
+            <w:shd w:fill="F2F2F2" w:val="clear"/>
+            <w:tcMar>
+              <w:top w:type="dxa" w:w="40"/>
+              <w:left w:type="dxa" w:w="100"/>
+              <w:bottom w:type="dxa" w:w="40"/>
+              <w:right w:type="dxa" w:w="100"/>
+            </w:tcMar>
+          </w:tcPr>
+          <w:p>
+            <w:r>
+              <w:rPr>
+                <w:b w:val="false"/>
+                <w:bCs w:val="false"/>
+                <w:color w:val="000000"/>
+                <w:sz w:val="18"/>
+                <w:szCs w:val="18"/>
+              </w:rPr>
+              <w:t xml:space="preserve">Strategic suppliers, high spend, or unusual pricing require approval before offer or payment changes</w:t>
+            </w:r>
+          </w:p>
+        </w:tc>
+      </w:tr>
+      <w:tr>
+        <w:trPr>
+          <w:tblHeader w:val="false"/>
+        </w:trPr>
+        <w:tc>
+          <w:tcPr>
+            <w:tcW w:type="dxa" w:w="3000"/>
+            <w:shd w:fill="FFFFFF" w:val="clear"/>
+            <w:tcMar>
+              <w:top w:type="dxa" w:w="40"/>
+              <w:left w:type="dxa" w:w="100"/>
+              <w:bottom w:type="dxa" w:w="40"/>
+              <w:right w:type="dxa" w:w="100"/>
+            </w:tcMar>
+          </w:tcPr>
+          <w:p>
+            <w:r>
+              <w:rPr>
+                <w:b w:val="false"/>
+                <w:bCs w:val="false"/>
+                <w:color w:val="000000"/>
+                <w:sz w:val="18"/>
+                <w:szCs w:val="18"/>
+              </w:rPr>
+              <w:t xml:space="preserve">Explainability &amp; audit</w:t>
+            </w:r>
+          </w:p>
+        </w:tc>
+        <w:tc>
+          <w:tcPr>
+            <w:tcW w:type="dxa" w:w="6360"/>
+            <w:shd w:fill="FFFFFF" w:val="clear"/>
+            <w:tcMar>
+              <w:top w:type="dxa" w:w="40"/>
+              <w:left w:type="dxa" w:w="100"/>
+              <w:bottom w:type="dxa" w:w="40"/>
+              <w:right w:type="dxa" w:w="100"/>
+            </w:tcMar>
+          </w:tcPr>
+          <w:p>
+            <w:r>
+              <w:rPr>
+                <w:b w:val="false"/>
+                <w:bCs w:val="false"/>
+                <w:color w:val="000000"/>
+                <w:sz w:val="18"/>
+                <w:szCs w:val="18"/>
+              </w:rPr>
+              <w:t xml:space="preserve">Every recommendation returns top drivers, expected economics, eligible alternatives, and policy reason codes; persist model version + realized economics</w:t>
+            </w:r>
+          </w:p>
+        </w:tc>
+      </w:tr>
+    </w:tbl>
+    <w:p>
+      <w:pPr>
+        <w:spacing w:before="60"/>
         <w:rPr>
-          <w:b/>
-          <w:bCs/>
-          <w:sz w:val="20"/>
-          <w:szCs w:val="20"/>
+          <w:color w:val="606060"/>
+          <w:sz w:val="19"/>
+          <w:szCs w:val="19"/>
         </w:rPr>
       </w:pPr>
       <w:r>
         <w:rPr>
-          <w:b/>
-          <w:bCs/>
-          <w:sz w:val="20"/>
-          <w:szCs w:val="20"/>
+          <w:color w:val="606060"/>
+          <w:sz w:val="19"/>
+          <w:szCs w:val="19"/>
         </w:rPr>
-        <w:t xml:space="preserve">Guardrails &amp; risks:</w:t>
-      </w:r>
-    </w:p>
-    <w:p>
-      <w:pPr>
-        <w:pStyle w:val="ListParagraph"/>
-        <w:numPr>
-          <w:ilvl w:val="0"/>
-          <w:numId w:val="2"/>
-        </w:numPr>
-        <w:spacing w:after="40"/>
-      </w:pPr>
-      <w:r>
-        <w:t xml:space="preserve">Synthetic data — live validation on real acceptance/qualification outcomes required before production claims.</w:t>
-      </w:r>
-    </w:p>
-    <w:p>
-      <w:pPr>
-        <w:pStyle w:val="ListParagraph"/>
-        <w:numPr>
-          <w:ilvl w:val="0"/>
-          <w:numId w:val="2"/>
-        </w:numPr>
-        <w:spacing w:after="40"/>
-      </w:pPr>
-      <w:r>
-        <w:t xml:space="preserve">Fairness &amp; compliance — price on economics only; similar profiles get similar offers. A policy ceiling / margin-sharing rule should cap the broad pile of vendors that tolerate the top rate. Networks set interchange; models recommend, humans/agents apply and move money.</w:t>
-      </w:r>
-    </w:p>
-    <w:p>
-      <w:pPr>
-        <w:pStyle w:val="ListParagraph"/>
-        <w:numPr>
-          <w:ilvl w:val="0"/>
-          <w:numId w:val="2"/>
-        </w:numPr>
-        <w:spacing w:after="40"/>
-      </w:pPr>
-      <w:r>
-        <w:t xml:space="preserve">Not modeled as levers — supplier lock-in / switching difficulty, negotiating sophistication, or personal/behavioral data are deliberately excluded from the objective (that would be opaque extraction, not value-based pricing).</w:t>
+        <w:t xml:space="preserve">Deliberately NOT modeled as levers: supplier lock-in / switching difficulty, negotiating sophistication, or personal/behavioral data — that would be opaque extraction, not value-based pricing.</w:t>
       </w:r>
     </w:p>
     <w:p>
@@ -2809,7 +3075,7 @@
         <w:spacing w:after="40"/>
       </w:pPr>
       <w:r>
-        <w:t xml:space="preserve">Add churn and servicing-cost models as optimizer inputs; extend the objective to full lifetime value.</w:t>
+        <w:t xml:space="preserve">Live validation: historical backtest → shadow mode → randomized outreach test → offer experiment → controlled rollout. North star = incremental 12-month accepted spend vs control.</w:t>
       </w:r>
     </w:p>
     <w:p>
@@ -2822,7 +3088,7 @@
         <w:spacing w:after="40"/>
       </w:pPr>
       <w:r>
-        <w:t xml:space="preserve">Build the policy layer (min/max, fee caps, fairness ceiling) and the LLM signal extractor (Claude) from stubs.</w:t>
+        <w:t xml:space="preserve">Add churn and servicing-cost models; build the policy layer (min/max, fee caps, fairness ceiling) and the LLM signal extractor (Claude) from stubs.</w:t>
       </w:r>
     </w:p>
     <w:p>
@@ -2835,7 +3101,7 @@
         <w:spacing w:after="40"/>
       </w:pPr>
       <w:r>
-        <w:t xml:space="preserve">Integrate: expose recommended offers to the AP-automation negotiation/outreach agents; feed accept/decline outcomes back for retraining.</w:t>
+        <w:t xml:space="preserve">Integrate: expose recommended offers to the AP-automation outreach agents; feed accept/decline outcomes back for retraining.</w:t>
       </w:r>
     </w:p>
     <w:sectPr>
@@ -2902,7 +3168,7 @@
         <w:sz w:val="15"/>
         <w:szCs w:val="15"/>
       </w:rPr>
-      <w:t xml:space="preserve">Confidential — Working Draft   |   Vendor Payment Intelligence PRD v0.2   |   Page </w:t>
+      <w:t xml:space="preserve">Confidential — Working Draft   |   Vendor Payment Intelligence PRD v0.3   |   Page </w:t>
     </w:r>
     <w:r>
       <w:rPr>

</xml_diff>

<commit_message>
PRD v0.4: add Model D buyer-side rebate optimization extension
Mirror of Model C with buyer rebate as decision variable; minimum-rebate-to-win
framing, approved-band + net-economics guardrails.

Co-Authored-By: Claude Opus 4.8 <noreply@anthropic.com>
</commit_message>
<xml_diff>
--- a/PRD_Vendor_Payment_Intelligence.docx
+++ b/PRD_Vendor_Payment_Intelligence.docx
@@ -43,7 +43,7 @@
           <w:sz w:val="21"/>
           <w:szCs w:val="21"/>
         </w:rPr>
-        <w:t xml:space="preserve">ML-driven supplier conversion, offer optimization, and interchange qualification</w:t>
+        <w:t xml:space="preserve">ML-driven supplier conversion, offer optimization, interchange qualification &amp; buyer rebate</w:t>
       </w:r>
     </w:p>
     <w:p>
@@ -61,7 +61,7 @@
           <w:sz w:val="18"/>
           <w:szCs w:val="18"/>
         </w:rPr>
-        <w:t xml:space="preserve">v0.3  ·  July 6, 2026  ·  Working draft (synthetic-data prototype)  ·  Precursor to the Corpay Agentic AP Automation platform</w:t>
+        <w:t xml:space="preserve">v0.4  ·  July 6, 2026  ·  Working draft (synthetic-data prototype)  ·  Precursor to the Corpay Agentic AP Automation platform</w:t>
       </w:r>
     </w:p>
     <w:p>
@@ -77,7 +77,7 @@
         <w:spacing w:after="100"/>
       </w:pPr>
       <w:r>
-        <w:t xml:space="preserve">Corpay can increase virtual-card contribution by making three linked decisions better: which ACH/check suppliers to approach, which transparent commercial offer to present, and which valid network program each accepted transaction should qualify for. The system is a decision layer; payment execution, authorization, ledger posting, and money movement remain in existing regulated systems.</w:t>
+        <w:t xml:space="preserve">Corpay can increase virtual-card contribution by making a set of linked decisions better: which ACH/check suppliers to approach, which transparent commercial offer to present, which valid network program each accepted transaction should qualify for, and (buyer side) which rebate wins and retains each customer. The system is a decision layer; payment execution, authorization, ledger posting, and money movement remain in existing regulated systems.</w:t>
       </w:r>
     </w:p>
     <w:p>
@@ -427,6 +427,83 @@
           </w:p>
         </w:tc>
       </w:tr>
+      <w:tr>
+        <w:trPr>
+          <w:tblHeader w:val="false"/>
+        </w:trPr>
+        <w:tc>
+          <w:tcPr>
+            <w:tcW w:type="dxa" w:w="2340"/>
+            <w:shd w:fill="F2F2F2" w:val="clear"/>
+            <w:tcMar>
+              <w:top w:type="dxa" w:w="40"/>
+              <w:left w:type="dxa" w:w="100"/>
+              <w:bottom w:type="dxa" w:w="40"/>
+              <w:right w:type="dxa" w:w="100"/>
+            </w:tcMar>
+          </w:tcPr>
+          <w:p>
+            <w:r>
+              <w:rPr>
+                <w:b w:val="false"/>
+                <w:bCs w:val="false"/>
+                <w:color w:val="000000"/>
+                <w:sz w:val="18"/>
+                <w:szCs w:val="18"/>
+              </w:rPr>
+              <w:t xml:space="preserve">D · Buyer rebate optimization</w:t>
+            </w:r>
+          </w:p>
+        </w:tc>
+        <w:tc>
+          <w:tcPr>
+            <w:tcW w:type="dxa" w:w="3900"/>
+            <w:shd w:fill="F2F2F2" w:val="clear"/>
+            <w:tcMar>
+              <w:top w:type="dxa" w:w="40"/>
+              <w:left w:type="dxa" w:w="100"/>
+              <w:bottom w:type="dxa" w:w="40"/>
+              <w:right w:type="dxa" w:w="100"/>
+            </w:tcMar>
+          </w:tcPr>
+          <w:p>
+            <w:r>
+              <w:rPr>
+                <w:b w:val="false"/>
+                <w:bCs w:val="false"/>
+                <w:color w:val="000000"/>
+                <w:sz w:val="18"/>
+                <w:szCs w:val="18"/>
+              </w:rPr>
+              <w:t xml:space="preserve">Which rebate wins and retains this customer at the best lifetime profit?</w:t>
+            </w:r>
+          </w:p>
+        </w:tc>
+        <w:tc>
+          <w:tcPr>
+            <w:tcW w:type="dxa" w:w="3120"/>
+            <w:shd w:fill="F2F2F2" w:val="clear"/>
+            <w:tcMar>
+              <w:top w:type="dxa" w:w="40"/>
+              <w:left w:type="dxa" w:w="100"/>
+              <w:bottom w:type="dxa" w:w="40"/>
+              <w:right w:type="dxa" w:w="100"/>
+            </w:tcMar>
+          </w:tcPr>
+          <w:p>
+            <w:r>
+              <w:rPr>
+                <w:b w:val="false"/>
+                <w:bCs w:val="false"/>
+                <w:color w:val="000000"/>
+                <w:sz w:val="18"/>
+                <w:szCs w:val="18"/>
+              </w:rPr>
+              <w:t xml:space="preserve">Recommended rebate band (subject to approval)</w:t>
+            </w:r>
+          </w:p>
+        </w:tc>
+      </w:tr>
     </w:tbl>
     <w:p>
       <w:pPr>
@@ -441,7 +518,7 @@
         <w:spacing w:after="100"/>
       </w:pPr>
       <w:r>
-        <w:t xml:space="preserve">Virtual card is economically attractive, but adoption is constrained by supplier acceptance cost, invoice size, merchant pricing, operational burden, and relationship dynamics. Static campaigns waste effort on low-propensity suppliers; static offers overpay easy conversions and lose price-sensitive ones; and after conversion, incomplete qualification logic can leave legitimate interchange economics unrealized. A defensible engine prices each supplier on economics such as:</w:t>
+        <w:t xml:space="preserve">Virtual card is economically attractive, but adoption is constrained by supplier acceptance cost, invoice size, merchant pricing, operational burden, and relationship dynamics. Static campaigns waste effort on low-propensity suppliers; static offers overpay easy conversions and lose price-sensitive ones; and after conversion, incomplete qualification logic can leave legitimate interchange economics unrealized. A defensible engine prices each supplier — and each buyer — on economics such as:</w:t>
       </w:r>
     </w:p>
     <w:tbl>
@@ -537,7 +614,7 @@
                 <w:sz w:val="18"/>
                 <w:szCs w:val="18"/>
               </w:rPr>
-              <w:t xml:space="preserve">Annual payment volume</w:t>
+              <w:t xml:space="preserve">Annual payment / card volume</w:t>
             </w:r>
           </w:p>
         </w:tc>
@@ -561,7 +638,7 @@
                 <w:sz w:val="18"/>
                 <w:szCs w:val="18"/>
               </w:rPr>
-              <w:t xml:space="preserve">Higher volume can justify a lower rate</w:t>
+              <w:t xml:space="preserve">Higher volume can justify a lower rate (supplier) or higher rebate (buyer)</w:t>
             </w:r>
           </w:p>
         </w:tc>
@@ -749,7 +826,7 @@
                 <w:sz w:val="18"/>
                 <w:szCs w:val="18"/>
               </w:rPr>
-              <w:t xml:space="preserve">Card-acceptance history</w:t>
+              <w:t xml:space="preserve">Card-acceptance history / rate</w:t>
             </w:r>
           </w:p>
         </w:tc>
@@ -908,7 +985,7 @@
                 <w:sz w:val="18"/>
                 <w:szCs w:val="18"/>
               </w:rPr>
-              <w:t xml:space="preserve">Servicing cost</w:t>
+              <w:t xml:space="preserve">Servicing / implementation cost</w:t>
             </w:r>
           </w:p>
         </w:tc>
@@ -932,7 +1009,7 @@
                 <w:sz w:val="18"/>
                 <w:szCs w:val="18"/>
               </w:rPr>
-              <w:t xml:space="preserve">High-touch suppliers change the contribution math</w:t>
+              <w:t xml:space="preserve">High-touch accounts change the contribution math</w:t>
             </w:r>
           </w:p>
         </w:tc>
@@ -953,7 +1030,7 @@
           <w:sz w:val="19"/>
           <w:szCs w:val="19"/>
         </w:rPr>
-        <w:t xml:space="preserve">Objective (explicit): maximize long-term contribution while keeping acceptance sustainable — NOT charge the highest possible fee to suppliers least able to leave. Rates illustrative; networks set interchange, Corpay optimizes the negotiable, disclosed supplier package.</w:t>
+        <w:t xml:space="preserve">Objective (explicit): maximize long-term contribution while keeping acceptance sustainable — NOT charge the highest possible fee to suppliers least able to leave, nor over-pay rebates to win accounts that never earn it back. Rates illustrative; networks set interchange, Corpay optimizes the negotiable, disclosed package.</w:t>
       </w:r>
     </w:p>
     <w:p>
@@ -1077,19 +1154,6 @@
     </w:p>
     <w:p>
       <w:pPr>
-        <w:pStyle w:val="ListParagraph"/>
-        <w:numPr>
-          <w:ilvl w:val="0"/>
-          <w:numId w:val="2"/>
-        </w:numPr>
-        <w:spacing w:after="40"/>
-      </w:pPr>
-      <w:r>
-        <w:t xml:space="preserve">Measure realized qualification rate and net contribution after buyer rebates, network costs, subsidies, support, and attrition.</w:t>
-      </w:r>
-    </w:p>
-    <w:p>
-      <w:pPr>
         <w:pStyle w:val="Heading2"/>
       </w:pPr>
       <w:r>
@@ -1117,7 +1181,665 @@
         <w:pStyle w:val="Heading1"/>
       </w:pPr>
       <w:r>
-        <w:t xml:space="preserve">4. Experimentation &amp; Results</w:t>
+        <w:t xml:space="preserve">4. Extension — Buyer Rebate Optimization (Model D)</w:t>
+      </w:r>
+    </w:p>
+    <w:p>
+      <w:pPr>
+        <w:spacing w:after="100"/>
+        <w:rPr>
+          <w:sz w:val="19"/>
+          <w:szCs w:val="19"/>
+        </w:rPr>
+      </w:pPr>
+      <w:r>
+        <w:rPr>
+          <w:sz w:val="19"/>
+          <w:szCs w:val="19"/>
+        </w:rPr>
+        <w:t xml:space="preserve">The same offer-optimization architecture applies to the BUYER side, where it is arguably more directly actionable: Corpay controls the customer rebate contract more directly than it controls supplier interchange, and already publicly describes rebates as tailored to a company's spend and purchase patterns. The decision variable becomes the buyer rebate; the economics already treat buyer rebate as a cost, so Model C is reused with limited changes.</w:t>
+      </w:r>
+    </w:p>
+    <w:p>
+      <w:pPr>
+        <w:spacing w:after="100"/>
+        <w:rPr>
+          <w:sz w:val="19"/>
+          <w:szCs w:val="19"/>
+        </w:rPr>
+      </w:pPr>
+      <w:r>
+        <w:rPr>
+          <w:sz w:val="19"/>
+          <w:szCs w:val="19"/>
+        </w:rPr>
+        <w:t xml:space="preserve">Decision: from approved rebate bands, choose the MINIMUM rebate required to win and retain each customer — maximizing P(sign at rebate) × expected lifetime contribution at that rebate — not simply giving high-value customers higher rebates.</w:t>
+      </w:r>
+    </w:p>
+    <w:tbl>
+      <w:tblPr>
+        <w:tblW w:type="dxa" w:w="9360"/>
+        <w:tblBorders>
+          <w:top w:val="single" w:color="BFBFBF" w:sz="1"/>
+          <w:left w:val="single" w:color="BFBFBF" w:sz="1"/>
+          <w:bottom w:val="single" w:color="BFBFBF" w:sz="1"/>
+          <w:right w:val="single" w:color="BFBFBF" w:sz="1"/>
+          <w:insideH w:val="single" w:color="BFBFBF" w:sz="1"/>
+          <w:insideV w:val="single" w:color="BFBFBF" w:sz="1"/>
+        </w:tblBorders>
+      </w:tblPr>
+      <w:tblGrid>
+        <w:gridCol w:w="4680"/>
+        <w:gridCol w:w="4680"/>
+      </w:tblGrid>
+      <w:tr>
+        <w:trPr>
+          <w:tblHeader/>
+        </w:trPr>
+        <w:tc>
+          <w:tcPr>
+            <w:tcW w:type="dxa" w:w="4680"/>
+            <w:shd w:fill="1F3864" w:val="clear"/>
+            <w:tcMar>
+              <w:top w:type="dxa" w:w="40"/>
+              <w:left w:type="dxa" w:w="100"/>
+              <w:bottom w:type="dxa" w:w="40"/>
+              <w:right w:type="dxa" w:w="100"/>
+            </w:tcMar>
+          </w:tcPr>
+          <w:p>
+            <w:r>
+              <w:rPr>
+                <w:b/>
+                <w:bCs/>
+                <w:color w:val="FFFFFF"/>
+                <w:sz w:val="18"/>
+                <w:szCs w:val="18"/>
+              </w:rPr>
+              <w:t xml:space="preserve">Buyer profile factors</w:t>
+            </w:r>
+          </w:p>
+        </w:tc>
+        <w:tc>
+          <w:tcPr>
+            <w:tcW w:type="dxa" w:w="4680"/>
+            <w:shd w:fill="1F3864" w:val="clear"/>
+            <w:tcMar>
+              <w:top w:type="dxa" w:w="40"/>
+              <w:left w:type="dxa" w:w="100"/>
+              <w:bottom w:type="dxa" w:w="40"/>
+              <w:right w:type="dxa" w:w="100"/>
+            </w:tcMar>
+          </w:tcPr>
+          <w:p>
+            <w:r>
+              <w:rPr>
+                <w:b/>
+                <w:bCs/>
+                <w:color w:val="FFFFFF"/>
+                <w:sz w:val="18"/>
+                <w:szCs w:val="18"/>
+              </w:rPr>
+              <w:t xml:space="preserve"/>
+            </w:r>
+          </w:p>
+        </w:tc>
+      </w:tr>
+      <w:tr>
+        <w:trPr>
+          <w:tblHeader w:val="false"/>
+        </w:trPr>
+        <w:tc>
+          <w:tcPr>
+            <w:tcW w:type="dxa" w:w="4680"/>
+            <w:shd w:fill="FFFFFF" w:val="clear"/>
+            <w:tcMar>
+              <w:top w:type="dxa" w:w="40"/>
+              <w:left w:type="dxa" w:w="100"/>
+              <w:bottom w:type="dxa" w:w="40"/>
+              <w:right w:type="dxa" w:w="100"/>
+            </w:tcMar>
+          </w:tcPr>
+          <w:p>
+            <w:r>
+              <w:rPr>
+                <w:b w:val="false"/>
+                <w:bCs w:val="false"/>
+                <w:color w:val="000000"/>
+                <w:sz w:val="18"/>
+                <w:szCs w:val="18"/>
+              </w:rPr>
+              <w:t xml:space="preserve">Expected annual card spend</w:t>
+            </w:r>
+          </w:p>
+        </w:tc>
+        <w:tc>
+          <w:tcPr>
+            <w:tcW w:type="dxa" w:w="4680"/>
+            <w:shd w:fill="FFFFFF" w:val="clear"/>
+            <w:tcMar>
+              <w:top w:type="dxa" w:w="40"/>
+              <w:left w:type="dxa" w:w="100"/>
+              <w:bottom w:type="dxa" w:w="40"/>
+              <w:right w:type="dxa" w:w="100"/>
+            </w:tcMar>
+          </w:tcPr>
+          <w:p>
+            <w:r>
+              <w:rPr>
+                <w:b w:val="false"/>
+                <w:bCs w:val="false"/>
+                <w:color w:val="000000"/>
+                <w:sz w:val="18"/>
+                <w:szCs w:val="18"/>
+              </w:rPr>
+              <w:t xml:space="preserve">Share of spend migrating from ACH/check</w:t>
+            </w:r>
+          </w:p>
+        </w:tc>
+      </w:tr>
+      <w:tr>
+        <w:trPr>
+          <w:tblHeader w:val="false"/>
+        </w:trPr>
+        <w:tc>
+          <w:tcPr>
+            <w:tcW w:type="dxa" w:w="4680"/>
+            <w:shd w:fill="F2F2F2" w:val="clear"/>
+            <w:tcMar>
+              <w:top w:type="dxa" w:w="40"/>
+              <w:left w:type="dxa" w:w="100"/>
+              <w:bottom w:type="dxa" w:w="40"/>
+              <w:right w:type="dxa" w:w="100"/>
+            </w:tcMar>
+          </w:tcPr>
+          <w:p>
+            <w:r>
+              <w:rPr>
+                <w:b w:val="false"/>
+                <w:bCs w:val="false"/>
+                <w:color w:val="000000"/>
+                <w:sz w:val="18"/>
+                <w:szCs w:val="18"/>
+              </w:rPr>
+              <w:t xml:space="preserve">Vendor acceptance rate</w:t>
+            </w:r>
+          </w:p>
+        </w:tc>
+        <w:tc>
+          <w:tcPr>
+            <w:tcW w:type="dxa" w:w="4680"/>
+            <w:shd w:fill="F2F2F2" w:val="clear"/>
+            <w:tcMar>
+              <w:top w:type="dxa" w:w="40"/>
+              <w:left w:type="dxa" w:w="100"/>
+              <w:bottom w:type="dxa" w:w="40"/>
+              <w:right w:type="dxa" w:w="100"/>
+            </w:tcMar>
+          </w:tcPr>
+          <w:p>
+            <w:r>
+              <w:rPr>
+                <w:b w:val="false"/>
+                <w:bCs w:val="false"/>
+                <w:color w:val="000000"/>
+                <w:sz w:val="18"/>
+                <w:szCs w:val="18"/>
+              </w:rPr>
+              <w:t xml:space="preserve">Mix of high / low interchange transactions</w:t>
+            </w:r>
+          </w:p>
+        </w:tc>
+      </w:tr>
+      <w:tr>
+        <w:trPr>
+          <w:tblHeader w:val="false"/>
+        </w:trPr>
+        <w:tc>
+          <w:tcPr>
+            <w:tcW w:type="dxa" w:w="4680"/>
+            <w:shd w:fill="FFFFFF" w:val="clear"/>
+            <w:tcMar>
+              <w:top w:type="dxa" w:w="40"/>
+              <w:left w:type="dxa" w:w="100"/>
+              <w:bottom w:type="dxa" w:w="40"/>
+              <w:right w:type="dxa" w:w="100"/>
+            </w:tcMar>
+          </w:tcPr>
+          <w:p>
+            <w:r>
+              <w:rPr>
+                <w:b w:val="false"/>
+                <w:bCs w:val="false"/>
+                <w:color w:val="000000"/>
+                <w:sz w:val="18"/>
+                <w:szCs w:val="18"/>
+              </w:rPr>
+              <w:t xml:space="preserve">Payment timing &amp; credit risk</w:t>
+            </w:r>
+          </w:p>
+        </w:tc>
+        <w:tc>
+          <w:tcPr>
+            <w:tcW w:type="dxa" w:w="4680"/>
+            <w:shd w:fill="FFFFFF" w:val="clear"/>
+            <w:tcMar>
+              <w:top w:type="dxa" w:w="40"/>
+              <w:left w:type="dxa" w:w="100"/>
+              <w:bottom w:type="dxa" w:w="40"/>
+              <w:right w:type="dxa" w:w="100"/>
+            </w:tcMar>
+          </w:tcPr>
+          <w:p>
+            <w:r>
+              <w:rPr>
+                <w:b w:val="false"/>
+                <w:bCs w:val="false"/>
+                <w:color w:val="000000"/>
+                <w:sz w:val="18"/>
+                <w:szCs w:val="18"/>
+              </w:rPr>
+              <w:t xml:space="preserve">Implementation &amp; servicing cost</w:t>
+            </w:r>
+          </w:p>
+        </w:tc>
+      </w:tr>
+      <w:tr>
+        <w:trPr>
+          <w:tblHeader w:val="false"/>
+        </w:trPr>
+        <w:tc>
+          <w:tcPr>
+            <w:tcW w:type="dxa" w:w="4680"/>
+            <w:shd w:fill="F2F2F2" w:val="clear"/>
+            <w:tcMar>
+              <w:top w:type="dxa" w:w="40"/>
+              <w:left w:type="dxa" w:w="100"/>
+              <w:bottom w:type="dxa" w:w="40"/>
+              <w:right w:type="dxa" w:w="100"/>
+            </w:tcMar>
+          </w:tcPr>
+          <w:p>
+            <w:r>
+              <w:rPr>
+                <w:b w:val="false"/>
+                <w:bCs w:val="false"/>
+                <w:color w:val="000000"/>
+                <w:sz w:val="18"/>
+                <w:szCs w:val="18"/>
+              </w:rPr>
+              <w:t xml:space="preserve">Contract length &amp; churn likelihood</w:t>
+            </w:r>
+          </w:p>
+        </w:tc>
+        <w:tc>
+          <w:tcPr>
+            <w:tcW w:type="dxa" w:w="4680"/>
+            <w:shd w:fill="F2F2F2" w:val="clear"/>
+            <w:tcMar>
+              <w:top w:type="dxa" w:w="40"/>
+              <w:left w:type="dxa" w:w="100"/>
+              <w:bottom w:type="dxa" w:w="40"/>
+              <w:right w:type="dxa" w:w="100"/>
+            </w:tcMar>
+          </w:tcPr>
+          <w:p>
+            <w:r>
+              <w:rPr>
+                <w:b w:val="false"/>
+                <w:bCs w:val="false"/>
+                <w:color w:val="000000"/>
+                <w:sz w:val="18"/>
+                <w:szCs w:val="18"/>
+              </w:rPr>
+              <w:t xml:space="preserve">Strategic value of the customer</w:t>
+            </w:r>
+          </w:p>
+        </w:tc>
+      </w:tr>
+    </w:tbl>
+    <w:p>
+      <w:pPr>
+        <w:spacing w:after="100"/>
+        <w:rPr>
+          <w:i/>
+          <w:iCs/>
+          <w:sz w:val="19"/>
+          <w:szCs w:val="19"/>
+        </w:rPr>
+      </w:pPr>
+      <w:r>
+        <w:rPr>
+          <w:i/>
+          <w:iCs/>
+          <w:sz w:val="19"/>
+          <w:szCs w:val="19"/>
+        </w:rPr>
+        <w:t xml:space="preserve">Objective: Expected contribution = card spend × Corpay net interchange take − customer rebate − implementation cost − servicing cost − credit cost − expected attrition loss.</w:t>
+      </w:r>
+    </w:p>
+    <w:tbl>
+      <w:tblPr>
+        <w:tblW w:type="dxa" w:w="9360"/>
+        <w:tblBorders>
+          <w:top w:val="single" w:color="BFBFBF" w:sz="1"/>
+          <w:left w:val="single" w:color="BFBFBF" w:sz="1"/>
+          <w:bottom w:val="single" w:color="BFBFBF" w:sz="1"/>
+          <w:right w:val="single" w:color="BFBFBF" w:sz="1"/>
+          <w:insideH w:val="single" w:color="BFBFBF" w:sz="1"/>
+          <w:insideV w:val="single" w:color="BFBFBF" w:sz="1"/>
+        </w:tblBorders>
+      </w:tblPr>
+      <w:tblGrid>
+        <w:gridCol w:w="4680"/>
+        <w:gridCol w:w="4680"/>
+      </w:tblGrid>
+      <w:tr>
+        <w:trPr>
+          <w:tblHeader/>
+        </w:trPr>
+        <w:tc>
+          <w:tcPr>
+            <w:tcW w:type="dxa" w:w="4680"/>
+            <w:shd w:fill="1F3864" w:val="clear"/>
+            <w:tcMar>
+              <w:top w:type="dxa" w:w="40"/>
+              <w:left w:type="dxa" w:w="100"/>
+              <w:bottom w:type="dxa" w:w="40"/>
+              <w:right w:type="dxa" w:w="100"/>
+            </w:tcMar>
+          </w:tcPr>
+          <w:p>
+            <w:r>
+              <w:rPr>
+                <w:b/>
+                <w:bCs/>
+                <w:color w:val="FFFFFF"/>
+                <w:sz w:val="18"/>
+                <w:szCs w:val="18"/>
+              </w:rPr>
+              <w:t xml:space="preserve">Customer profile</w:t>
+            </w:r>
+          </w:p>
+        </w:tc>
+        <w:tc>
+          <w:tcPr>
+            <w:tcW w:type="dxa" w:w="4680"/>
+            <w:shd w:fill="1F3864" w:val="clear"/>
+            <w:tcMar>
+              <w:top w:type="dxa" w:w="40"/>
+              <w:left w:type="dxa" w:w="100"/>
+              <w:bottom w:type="dxa" w:w="40"/>
+              <w:right w:type="dxa" w:w="100"/>
+            </w:tcMar>
+          </w:tcPr>
+          <w:p>
+            <w:r>
+              <w:rPr>
+                <w:b/>
+                <w:bCs/>
+                <w:color w:val="FFFFFF"/>
+                <w:sz w:val="18"/>
+                <w:szCs w:val="18"/>
+              </w:rPr>
+              <w:t xml:space="preserve">Recommended rebate</w:t>
+            </w:r>
+          </w:p>
+        </w:tc>
+      </w:tr>
+      <w:tr>
+        <w:trPr>
+          <w:tblHeader w:val="false"/>
+        </w:trPr>
+        <w:tc>
+          <w:tcPr>
+            <w:tcW w:type="dxa" w:w="4680"/>
+            <w:shd w:fill="FFFFFF" w:val="clear"/>
+            <w:tcMar>
+              <w:top w:type="dxa" w:w="40"/>
+              <w:left w:type="dxa" w:w="100"/>
+              <w:bottom w:type="dxa" w:w="40"/>
+              <w:right w:type="dxa" w:w="100"/>
+            </w:tcMar>
+          </w:tcPr>
+          <w:p>
+            <w:r>
+              <w:rPr>
+                <w:b w:val="false"/>
+                <w:bCs w:val="false"/>
+                <w:color w:val="000000"/>
+                <w:sz w:val="18"/>
+                <w:szCs w:val="18"/>
+              </w:rPr>
+              <w:t xml:space="preserve">Low volume, high cost</w:t>
+            </w:r>
+          </w:p>
+        </w:tc>
+        <w:tc>
+          <w:tcPr>
+            <w:tcW w:type="dxa" w:w="4680"/>
+            <w:shd w:fill="FFFFFF" w:val="clear"/>
+            <w:tcMar>
+              <w:top w:type="dxa" w:w="40"/>
+              <w:left w:type="dxa" w:w="100"/>
+              <w:bottom w:type="dxa" w:w="40"/>
+              <w:right w:type="dxa" w:w="100"/>
+            </w:tcMar>
+          </w:tcPr>
+          <w:p>
+            <w:r>
+              <w:rPr>
+                <w:b w:val="false"/>
+                <w:bCs w:val="false"/>
+                <w:color w:val="000000"/>
+                <w:sz w:val="18"/>
+                <w:szCs w:val="18"/>
+              </w:rPr>
+              <w:t xml:space="preserve">0.30%</w:t>
+            </w:r>
+          </w:p>
+        </w:tc>
+      </w:tr>
+      <w:tr>
+        <w:trPr>
+          <w:tblHeader w:val="false"/>
+        </w:trPr>
+        <w:tc>
+          <w:tcPr>
+            <w:tcW w:type="dxa" w:w="4680"/>
+            <w:shd w:fill="F2F2F2" w:val="clear"/>
+            <w:tcMar>
+              <w:top w:type="dxa" w:w="40"/>
+              <w:left w:type="dxa" w:w="100"/>
+              <w:bottom w:type="dxa" w:w="40"/>
+              <w:right w:type="dxa" w:w="100"/>
+            </w:tcMar>
+          </w:tcPr>
+          <w:p>
+            <w:r>
+              <w:rPr>
+                <w:b w:val="false"/>
+                <w:bCs w:val="false"/>
+                <w:color w:val="000000"/>
+                <w:sz w:val="18"/>
+                <w:szCs w:val="18"/>
+              </w:rPr>
+              <w:t xml:space="preserve">Medium volume, standard economics</w:t>
+            </w:r>
+          </w:p>
+        </w:tc>
+        <w:tc>
+          <w:tcPr>
+            <w:tcW w:type="dxa" w:w="4680"/>
+            <w:shd w:fill="F2F2F2" w:val="clear"/>
+            <w:tcMar>
+              <w:top w:type="dxa" w:w="40"/>
+              <w:left w:type="dxa" w:w="100"/>
+              <w:bottom w:type="dxa" w:w="40"/>
+              <w:right w:type="dxa" w:w="100"/>
+            </w:tcMar>
+          </w:tcPr>
+          <w:p>
+            <w:r>
+              <w:rPr>
+                <w:b w:val="false"/>
+                <w:bCs w:val="false"/>
+                <w:color w:val="000000"/>
+                <w:sz w:val="18"/>
+                <w:szCs w:val="18"/>
+              </w:rPr>
+              <w:t xml:space="preserve">0.75%</w:t>
+            </w:r>
+          </w:p>
+        </w:tc>
+      </w:tr>
+      <w:tr>
+        <w:trPr>
+          <w:tblHeader w:val="false"/>
+        </w:trPr>
+        <w:tc>
+          <w:tcPr>
+            <w:tcW w:type="dxa" w:w="4680"/>
+            <w:shd w:fill="FFFFFF" w:val="clear"/>
+            <w:tcMar>
+              <w:top w:type="dxa" w:w="40"/>
+              <w:left w:type="dxa" w:w="100"/>
+              <w:bottom w:type="dxa" w:w="40"/>
+              <w:right w:type="dxa" w:w="100"/>
+            </w:tcMar>
+          </w:tcPr>
+          <w:p>
+            <w:r>
+              <w:rPr>
+                <w:b w:val="false"/>
+                <w:bCs w:val="false"/>
+                <w:color w:val="000000"/>
+                <w:sz w:val="18"/>
+                <w:szCs w:val="18"/>
+              </w:rPr>
+              <w:t xml:space="preserve">High volume, strong acceptance</w:t>
+            </w:r>
+          </w:p>
+        </w:tc>
+        <w:tc>
+          <w:tcPr>
+            <w:tcW w:type="dxa" w:w="4680"/>
+            <w:shd w:fill="FFFFFF" w:val="clear"/>
+            <w:tcMar>
+              <w:top w:type="dxa" w:w="40"/>
+              <w:left w:type="dxa" w:w="100"/>
+              <w:bottom w:type="dxa" w:w="40"/>
+              <w:right w:type="dxa" w:w="100"/>
+            </w:tcMar>
+          </w:tcPr>
+          <w:p>
+            <w:r>
+              <w:rPr>
+                <w:b w:val="false"/>
+                <w:bCs w:val="false"/>
+                <w:color w:val="000000"/>
+                <w:sz w:val="18"/>
+                <w:szCs w:val="18"/>
+              </w:rPr>
+              <w:t xml:space="preserve">1.10%</w:t>
+            </w:r>
+          </w:p>
+        </w:tc>
+      </w:tr>
+      <w:tr>
+        <w:trPr>
+          <w:tblHeader w:val="false"/>
+        </w:trPr>
+        <w:tc>
+          <w:tcPr>
+            <w:tcW w:type="dxa" w:w="4680"/>
+            <w:shd w:fill="F2F2F2" w:val="clear"/>
+            <w:tcMar>
+              <w:top w:type="dxa" w:w="40"/>
+              <w:left w:type="dxa" w:w="100"/>
+              <w:bottom w:type="dxa" w:w="40"/>
+              <w:right w:type="dxa" w:w="100"/>
+            </w:tcMar>
+          </w:tcPr>
+          <w:p>
+            <w:r>
+              <w:rPr>
+                <w:b w:val="false"/>
+                <w:bCs w:val="false"/>
+                <w:color w:val="000000"/>
+                <w:sz w:val="18"/>
+                <w:szCs w:val="18"/>
+              </w:rPr>
+              <w:t xml:space="preserve">Strategic enterprise</w:t>
+            </w:r>
+          </w:p>
+        </w:tc>
+        <w:tc>
+          <w:tcPr>
+            <w:tcW w:type="dxa" w:w="4680"/>
+            <w:shd w:fill="F2F2F2" w:val="clear"/>
+            <w:tcMar>
+              <w:top w:type="dxa" w:w="40"/>
+              <w:left w:type="dxa" w:w="100"/>
+              <w:bottom w:type="dxa" w:w="40"/>
+              <w:right w:type="dxa" w:w="100"/>
+            </w:tcMar>
+          </w:tcPr>
+          <w:p>
+            <w:r>
+              <w:rPr>
+                <w:b w:val="false"/>
+                <w:bCs w:val="false"/>
+                <w:color w:val="000000"/>
+                <w:sz w:val="18"/>
+                <w:szCs w:val="18"/>
+              </w:rPr>
+              <w:t xml:space="preserve">1.30%, subject to approval</w:t>
+            </w:r>
+          </w:p>
+        </w:tc>
+      </w:tr>
+    </w:tbl>
+    <w:p>
+      <w:pPr>
+        <w:spacing w:after="100"/>
+        <w:rPr>
+          <w:sz w:val="19"/>
+          <w:szCs w:val="19"/>
+        </w:rPr>
+      </w:pPr>
+      <w:r>
+        <w:rPr>
+          <w:sz w:val="19"/>
+          <w:szCs w:val="19"/>
+        </w:rPr>
+        <w:t xml:space="preserve">Worked examples: Customer A ($20M spend, strong acceptance, low servicing) → ~1.2%; Customer B ($3M eligible, weak acceptance, high implementation) → ~0.5%; Customer C (strategic, ~$80M likely to move) → ~1.4% to win, accepting lower initial margin.</w:t>
+      </w:r>
+    </w:p>
+    <w:p>
+      <w:pPr>
+        <w:spacing w:after="100"/>
+        <w:rPr>
+          <w:color w:val="606060"/>
+          <w:sz w:val="19"/>
+          <w:szCs w:val="19"/>
+        </w:rPr>
+      </w:pPr>
+      <w:r>
+        <w:rPr>
+          <w:color w:val="606060"/>
+          <w:sz w:val="19"/>
+          <w:szCs w:val="19"/>
+        </w:rPr>
+        <w:t xml:space="preserve">Guardrail: rebates come only from approved bands under finance and contract controls — never autonomous. The binding constraint is that the rebate cannot exceed the economics Corpay expects from the customer's actual transaction mix; a nominal 1.2% can be unprofitable if much of the spend qualifies for low interchange or needs supplier subsidies. Model D is therefore coupled to Model A (qualification) and Model C (supplier subsidies) to price true net economics. Feasibility: high; conceptual accuracy ~0.95.</w:t>
+      </w:r>
+    </w:p>
+    <w:p>
+      <w:pPr>
+        <w:pStyle w:val="Heading1"/>
+      </w:pPr>
+      <w:r>
+        <w:t xml:space="preserve">5. Experimentation &amp; Results</w:t>
       </w:r>
     </w:p>
     <w:p>
@@ -1491,7 +2213,7 @@
         <w:pStyle w:val="Heading2"/>
       </w:pPr>
       <w:r>
-        <w:t xml:space="preserve">Optimizer — worked examples</w:t>
+        <w:t xml:space="preserve">Optimizer — worked examples (supplier side)</w:t>
       </w:r>
     </w:p>
     <w:tbl>
@@ -1932,7 +2654,7 @@
           <w:sz w:val="19"/>
           <w:szCs w:val="19"/>
         </w:rPr>
-        <w:t xml:space="preserve">Honest interpretation: the synthetic prototype validates pipeline mechanics and metric definitions, not production lift — labels come from the same simulated world as the features. The 5-fold CV lift (0.786 vs 0.773) and 0.117 train/test gap are to be validated, not treated as safe.</w:t>
+        <w:t xml:space="preserve">Honest interpretation: the synthetic prototype validates pipeline mechanics and metric definitions, not production lift — labels come from the same simulated world as the features. The 5-fold CV lift (0.786 vs 0.773) and 0.117 train/test gap are to be validated, not treated as safe. Model D is specified but not yet prototyped.</w:t>
       </w:r>
     </w:p>
     <w:p>
@@ -1940,7 +2662,7 @@
         <w:pStyle w:val="Heading1"/>
       </w:pPr>
       <w:r>
-        <w:t xml:space="preserve">5. Experimentation Methodology, Datasets &amp; Repository</w:t>
+        <w:t xml:space="preserve">6. Experimentation Methodology, Datasets &amp; Repository</w:t>
       </w:r>
     </w:p>
     <w:p>
@@ -1956,7 +2678,7 @@
         </w:rPr>
         <w:t xml:space="preserve">Repository (private): </w:t>
       </w:r>
-      <w:hyperlink w:history="1" r:id="rIdls64homnzbrrlazq-6myb">
+      <w:hyperlink w:history="1" r:id="rIdldbsjnuyz7mxnxbvlf85p">
         <w:r>
           <w:rPr>
             <w:rStyle w:val="Hyperlink"/>
@@ -2689,7 +3411,7 @@
         <w:pStyle w:val="Heading1"/>
       </w:pPr>
       <w:r>
-        <w:t xml:space="preserve">6. Requirements, Guardrails &amp; Next Steps</w:t>
+        <w:t xml:space="preserve">7. Requirements, Guardrails &amp; Next Steps</w:t>
       </w:r>
     </w:p>
     <w:tbl>
@@ -2891,7 +3613,7 @@
                 <w:sz w:val="18"/>
                 <w:szCs w:val="18"/>
               </w:rPr>
-              <w:t xml:space="preserve">Fairness</w:t>
+              <w:t xml:space="preserve">Rebate controls</w:t>
             </w:r>
           </w:p>
         </w:tc>
@@ -2915,7 +3637,7 @@
                 <w:sz w:val="18"/>
                 <w:szCs w:val="18"/>
               </w:rPr>
-              <w:t xml:space="preserve">No sensitive personal attributes; price on economics only; enforce rate floors/caps and strategic-supplier overrides</w:t>
+              <w:t xml:space="preserve">Buyer rebates chosen from approved bands under finance/contract controls; rebate never exceeds expected net economics</w:t>
             </w:r>
           </w:p>
         </w:tc>
@@ -2944,7 +3666,7 @@
                 <w:sz w:val="18"/>
                 <w:szCs w:val="18"/>
               </w:rPr>
-              <w:t xml:space="preserve">Human control</w:t>
+              <w:t xml:space="preserve">Fairness</w:t>
             </w:r>
           </w:p>
         </w:tc>
@@ -2968,7 +3690,7 @@
                 <w:sz w:val="18"/>
                 <w:szCs w:val="18"/>
               </w:rPr>
-              <w:t xml:space="preserve">Strategic suppliers, high spend, or unusual pricing require approval before offer or payment changes</w:t>
+              <w:t xml:space="preserve">No sensitive personal attributes; price on economics only; enforce floors/caps and strategic overrides</w:t>
             </w:r>
           </w:p>
         </w:tc>
@@ -3021,7 +3743,7 @@
                 <w:sz w:val="18"/>
                 <w:szCs w:val="18"/>
               </w:rPr>
-              <w:t xml:space="preserve">Every recommendation returns top drivers, expected economics, eligible alternatives, and policy reason codes; persist model version + realized economics</w:t>
+              <w:t xml:space="preserve">Every recommendation returns top drivers, expected economics, eligible alternatives, and policy reason codes</w:t>
             </w:r>
           </w:p>
         </w:tc>
@@ -3075,7 +3797,7 @@
         <w:spacing w:after="40"/>
       </w:pPr>
       <w:r>
-        <w:t xml:space="preserve">Live validation: historical backtest → shadow mode → randomized outreach test → offer experiment → controlled rollout. North star = incremental 12-month accepted spend vs control.</w:t>
+        <w:t xml:space="preserve">Prototype Model D (buyer rebate) by reusing the Model C pipeline with rebate as the decision variable and sign-propensity as the label.</w:t>
       </w:r>
     </w:p>
     <w:p>
@@ -3088,7 +3810,7 @@
         <w:spacing w:after="40"/>
       </w:pPr>
       <w:r>
-        <w:t xml:space="preserve">Add churn and servicing-cost models; build the policy layer (min/max, fee caps, fairness ceiling) and the LLM signal extractor (Claude) from stubs.</w:t>
+        <w:t xml:space="preserve">Live validation: historical backtest → shadow mode → randomized outreach/offer test → controlled rollout. North star = incremental 12-month accepted spend vs control.</w:t>
       </w:r>
     </w:p>
     <w:p>
@@ -3101,7 +3823,7 @@
         <w:spacing w:after="40"/>
       </w:pPr>
       <w:r>
-        <w:t xml:space="preserve">Integrate: expose recommended offers to the AP-automation outreach agents; feed accept/decline outcomes back for retraining.</w:t>
+        <w:t xml:space="preserve">Integrate: expose recommended offers and rebates to the AP-automation agents; feed outcomes back for retraining.</w:t>
       </w:r>
     </w:p>
     <w:sectPr>
@@ -3168,7 +3890,7 @@
         <w:sz w:val="15"/>
         <w:szCs w:val="15"/>
       </w:rPr>
-      <w:t xml:space="preserve">Confidential — Working Draft   |   Vendor Payment Intelligence PRD v0.3   |   Page </w:t>
+      <w:t xml:space="preserve">Confidential — Working Draft   |   Vendor Payment Intelligence PRD v0.4   |   Page </w:t>
     </w:r>
     <w:r>
       <w:rPr>

</xml_diff>